<commit_message>
Build complete Word course package
</commit_message>
<xml_diff>
--- a/arbeitsblaetter/A11_Dokument_nach_Vorlage_nachbauen.docx
+++ b/arbeitsblaetter/A11_Dokument_nach_Vorlage_nachbauen.docx
@@ -226,7 +226,7 @@
             <w:r>
               <w:drawing>
                 <wp:inline xmlns:a="http://schemas.openxmlformats.org/drawingml/2006/main" xmlns:pic="http://schemas.openxmlformats.org/drawingml/2006/picture">
-                  <wp:extent cx="3924000" cy="2550600"/>
+                  <wp:extent cx="3096000" cy="2012400"/>
                   <wp:docPr id="1" name="Picture 1"/>
                   <wp:cNvGraphicFramePr>
                     <a:graphicFrameLocks noChangeAspect="1"/>
@@ -247,7 +247,7 @@
                         <pic:spPr>
                           <a:xfrm>
                             <a:off x="0" y="0"/>
-                            <a:ext cx="3924000" cy="2550600"/>
+                            <a:ext cx="3096000" cy="2012400"/>
                           </a:xfrm>
                           <a:prstGeom prst="rect"/>
                         </pic:spPr>
@@ -565,6 +565,127 @@
               <w:bottom w:w="75" w:type="dxa"/>
               <w:end w:w="130" w:type="dxa"/>
             </w:tcMar>
+            <w:shd w:fill="EAF4F3"/>
+          </w:tcPr>
+          <w:p>
+            <w:pPr>
+              <w:spacing w:after="0"/>
+              <w:jc w:val="center"/>
+            </w:pPr>
+            <w:r>
+              <w:rPr>
+                <w:rFonts w:ascii="Arial" w:hAnsi="Arial" w:eastAsia="Arial"/>
+                <w:b/>
+                <w:color w:val="1D6765"/>
+                <w:sz w:val="20"/>
+              </w:rPr>
+              <w:t>BILD</w:t>
+            </w:r>
+            <w:r>
+              <w:br/>
+            </w:r>
+            <w:r>
+              <w:rPr>
+                <w:rFonts w:ascii="Arial" w:hAnsi="Arial" w:eastAsia="Arial"/>
+                <w:b/>
+                <w:color w:val="1D6765"/>
+                <w:sz w:val="16"/>
+              </w:rPr>
+              <w:t>IM DOKUMENT</w:t>
+            </w:r>
+          </w:p>
+        </w:tc>
+        <w:tc>
+          <w:tcPr>
+            <w:tcW w:type="dxa" w:w="8003"/>
+            <w:vAlign w:val="center"/>
+            <w:tcMar>
+              <w:top w:w="75" w:type="dxa"/>
+              <w:start w:w="190" w:type="dxa"/>
+              <w:bottom w:w="75" w:type="dxa"/>
+              <w:end w:w="190" w:type="dxa"/>
+            </w:tcMar>
+            <w:shd w:fill="EAF4F3"/>
+          </w:tcPr>
+          <w:p>
+            <w:pPr>
+              <w:spacing w:after="40"/>
+            </w:pPr>
+            <w:r>
+              <w:rPr>
+                <w:rFonts w:ascii="Arial" w:hAnsi="Arial" w:eastAsia="Arial"/>
+                <w:color w:val="172A3A"/>
+                <w:sz w:val="18"/>
+              </w:rPr>
+              <w:t>Das Bild ist schon hier: anklicken → Strg + C → auf der Arbeitsseite Strg + V. Danach zuschneiden und platzieren.</w:t>
+            </w:r>
+          </w:p>
+          <w:p>
+            <w:pPr>
+              <w:spacing w:after="0" w:before="0"/>
+            </w:pPr>
+            <w:r>
+              <w:drawing>
+                <wp:inline xmlns:a="http://schemas.openxmlformats.org/drawingml/2006/main" xmlns:pic="http://schemas.openxmlformats.org/drawingml/2006/picture">
+                  <wp:extent cx="1512000" cy="1008000"/>
+                  <wp:docPr id="2" name="Picture 2"/>
+                  <wp:cNvGraphicFramePr>
+                    <a:graphicFrameLocks noChangeAspect="1"/>
+                  </wp:cNvGraphicFramePr>
+                  <a:graphic>
+                    <a:graphicData uri="http://schemas.openxmlformats.org/drawingml/2006/picture">
+                      <pic:pic>
+                        <pic:nvPicPr>
+                          <pic:cNvPr id="0" name="a11_klassenlager_berge.png"/>
+                          <pic:cNvPicPr/>
+                        </pic:nvPicPr>
+                        <pic:blipFill>
+                          <a:blip r:embed="rId12"/>
+                          <a:stretch>
+                            <a:fillRect/>
+                          </a:stretch>
+                        </pic:blipFill>
+                        <pic:spPr>
+                          <a:xfrm>
+                            <a:off x="0" y="0"/>
+                            <a:ext cx="1512000" cy="1008000"/>
+                          </a:xfrm>
+                          <a:prstGeom prst="rect"/>
+                        </pic:spPr>
+                      </pic:pic>
+                    </a:graphicData>
+                  </a:graphic>
+                </wp:inline>
+              </w:drawing>
+            </w:r>
+          </w:p>
+        </w:tc>
+      </w:tr>
+    </w:tbl>
+    <w:tbl>
+      <w:tblPr>
+        <w:tblW w:type="auto" w:w="0"/>
+        <w:tblLayout w:type="fixed"/>
+        <w:tblLook w:firstColumn="1" w:firstRow="1" w:lastColumn="0" w:lastRow="0" w:noHBand="0" w:noVBand="1" w:val="04A0"/>
+      </w:tblPr>
+      <w:tblGrid>
+        <w:gridCol w:w="1828"/>
+        <w:gridCol w:w="8003"/>
+      </w:tblGrid>
+      <w:tr>
+        <w:trPr>
+          <w:cantSplit/>
+        </w:trPr>
+        <w:tc>
+          <w:tcPr>
+            <w:tcW w:type="dxa" w:w="1828"/>
+            <w:vAlign w:val="center"/>
+            <w:tcMar>
+              <w:top w:w="75" w:type="dxa"/>
+              <w:start w:w="130" w:type="dxa"/>
+              <w:bottom w:w="75" w:type="dxa"/>
+              <w:end w:w="130" w:type="dxa"/>
+            </w:tcMar>
             <w:shd w:fill="FFFFFF"/>
             <w:tcBorders>
               <w:top w:val="single" w:sz="7" w:color="D3DEE2"/>
@@ -608,7 +729,7 @@
                 <w:color w:val="667684"/>
                 <w:sz w:val="19"/>
               </w:rPr>
-              <w:t>Gib dieses Arbeitsblatt zusammen mit der Bilddatei in deinem Ordner "IB" ab.</w:t>
+              <w:t>Speichere dieses Word-Dokument in deinem Ordner "IB" ab.</w:t>
             </w:r>
           </w:p>
         </w:tc>
@@ -851,24 +972,9 @@
         <w:t>Donnerstag | Aufräumen | Rückreise</w:t>
       </w:r>
     </w:p>
-    <w:p>
-      <w:pPr>
-        <w:spacing w:before="160"/>
-      </w:pPr>
-      <w:r>
-        <w:rPr>
-          <w:rFonts w:ascii="Arial" w:hAnsi="Arial" w:eastAsia="Arial"/>
-          <w:b/>
-          <w:i w:val="0"/>
-          <w:color w:val="1D6765"/>
-          <w:sz w:val="19"/>
-        </w:rPr>
-        <w:t>BILDDATEI: a11_klassenlager_berge.png</w:t>
-      </w:r>
-    </w:p>
     <w:sectPr>
-      <w:headerReference w:type="default" r:id="rId12"/>
-      <w:footerReference w:type="default" r:id="rId13"/>
+      <w:headerReference w:type="default" r:id="rId13"/>
+      <w:footerReference w:type="default" r:id="rId14"/>
       <w:pgSz w:w="11906" w:h="16838"/>
       <w:pgMar w:top="1020" w:right="1134" w:bottom="1020" w:left="1134" w:header="255" w:footer="312" w:gutter="0"/>
       <w:cols w:space="720"/>

</xml_diff>